<commit_message>
feat: bienvenida y firma bilateral con correos configurables
</commit_message>
<xml_diff>
--- a/HNControl.Web/assets/legal-templates/Acta_Entrega_Material_Servicios.docx
+++ b/HNControl.Web/assets/legal-templates/Acta_Entrega_Material_Servicios.docx
@@ -984,7 +984,52 @@
                 <w:szCs w:val="18"/>
                 <w:lang w:val="es-MX"/>
               </w:rPr>
-              <w:t>RSCLIENTE</w:t>
+              <w:t>RLCLIENTE</w:t>
+            </w:r>
+          </w:p>
+          <w:p>
+            <w:pPr>
+              <w:rPr>
+                <w:rFonts w:ascii="Helvetica Neue" w:hAnsi="Helvetica Neue"/>
+                <w:b/>
+                <w:color w:val="262626" w:themeColor="text1" w:themeTint="D9"/>
+                <w:sz w:val="18"/>
+                <w:szCs w:val="18"/>
+                <w:lang w:val="es-MX"/>
+              </w:rPr>
+            </w:pPr>
+            <w:r>
+              <w:rPr>
+                <w:rFonts w:ascii="Helvetica Neue" w:hAnsi="Helvetica Neue"/>
+                <w:b/>
+                <w:color w:val="262626" w:themeColor="text1" w:themeTint="D9"/>
+                <w:sz w:val="18"/>
+                <w:szCs w:val="18"/>
+                <w:lang w:val="es-MX"/>
+              </w:rPr>
+              <w:t>Correo:</w:t>
+            </w:r>
+            <w:r>
+              <w:rPr>
+                <w:rFonts w:ascii="Helvetica Neue" w:hAnsi="Helvetica Neue"/>
+                <w:b/>
+                <w:color w:val="262626" w:themeColor="text1" w:themeTint="D9"/>
+                <w:sz w:val="18"/>
+                <w:szCs w:val="18"/>
+                <w:lang w:val="es-MX"/>
+              </w:rPr>
+              <w:t xml:space="preserve"> </w:t>
+            </w:r>
+            <w:r>
+              <w:rPr>
+                <w:rFonts w:ascii="Helvetica Neue" w:hAnsi="Helvetica Neue"/>
+                <w:bCs/>
+                <w:color w:val="262626" w:themeColor="text1" w:themeTint="D9"/>
+                <w:sz w:val="18"/>
+                <w:szCs w:val="18"/>
+                <w:lang w:val="es-MX"/>
+              </w:rPr>
+              <w:t>CORREOFACTURA</w:t>
             </w:r>
           </w:p>
           <w:p>
@@ -3872,7 +3917,7 @@
                 <w:sz w:val="16"/>
                 <w:szCs w:val="16"/>
               </w:rPr>
-              <w:t>Firma</w:t>
+              <w:t>Firma: FIRMAHN</w:t>
             </w:r>
           </w:p>
         </w:tc>
@@ -4177,7 +4222,7 @@
                 <w:sz w:val="16"/>
                 <w:szCs w:val="16"/>
               </w:rPr>
-              <w:t>Firma</w:t>
+              <w:t>Firma: FIRMACLIENTE</w:t>
             </w:r>
           </w:p>
         </w:tc>

</xml_diff>

<commit_message>
fix: mantener firmas y hashes visibles en actas y NDA
</commit_message>
<xml_diff>
--- a/HNControl.Web/assets/legal-templates/Acta_Entrega_Material_Servicios.docx
+++ b/HNControl.Web/assets/legal-templates/Acta_Entrega_Material_Servicios.docx
@@ -3589,335 +3589,293 @@
     </w:tbl>
     <w:p>
       <w:pPr>
-        <w:spacing w:after="200" w:line="276" w:lineRule="auto"/>
+        <w:keepNext/>
+        <w:keepLines/>
+        <w:spacing w:before="100" w:after="50" w:line="240" w:lineRule="auto"/>
+        <w:jc w:val="left"/>
+      </w:pPr>
+      <w:r>
         <w:rPr>
-          <w:rFonts w:ascii="Helvetica Neue" w:hAnsi="Helvetica Neue"/>
+          <w:rFonts w:ascii="Arial" w:hAnsi="Arial"/>
           <w:b/>
-          <w:bCs/>
-          <w:color w:val="595959" w:themeColor="text1" w:themeTint="A6"/>
-          <w:sz w:val="22"/>
-          <w:szCs w:val="22"/>
+          <w:color w:val="222222"/>
+          <w:sz w:val="20"/>
+          <w:szCs w:val="20"/>
         </w:rPr>
-      </w:pPr>
+        <w:t>Conformidad de entrega</w:t>
+      </w:r>
     </w:p>
     <w:p>
       <w:pPr>
-        <w:spacing w:after="200" w:line="276" w:lineRule="auto"/>
-        <w:rPr>
-          <w:rFonts w:ascii="Helvetica Neue" w:hAnsi="Helvetica Neue"/>
-          <w:b/>
-          <w:bCs/>
-          <w:color w:val="595959" w:themeColor="text1" w:themeTint="A6"/>
-          <w:sz w:val="22"/>
-          <w:szCs w:val="22"/>
-        </w:rPr>
+        <w:keepNext/>
+        <w:keepLines/>
+        <w:spacing w:before="0" w:after="70" w:line="240" w:lineRule="auto"/>
+        <w:jc w:val="left"/>
       </w:pPr>
       <w:r>
         <w:rPr>
-          <w:rFonts w:ascii="Helvetica Neue" w:hAnsi="Helvetica Neue"/>
-          <w:b/>
-          <w:bCs/>
-          <w:color w:val="595959" w:themeColor="text1" w:themeTint="A6"/>
-          <w:sz w:val="22"/>
-          <w:szCs w:val="22"/>
+          <w:rFonts w:ascii="Arial" w:hAnsi="Arial"/>
+          <w:color w:val="222222"/>
+          <w:sz w:val="18"/>
+          <w:szCs w:val="18"/>
         </w:rPr>
-        <w:t>Entrega</w:t>
+        <w:t>Fecha de entrega: FECHAHOY</w:t>
       </w:r>
     </w:p>
     <w:tbl>
       <w:tblPr>
-        <w:tblStyle w:val="Tablaconcuadrcula"/>
-        <w:tblW w:w="0" w:type="auto"/>
-        <w:tblLook w:val="04A0" w:firstRow="1" w:lastRow="0" w:firstColumn="1" w:lastColumn="0" w:noHBand="0" w:noVBand="1"/>
+        <w:tblW w:w="10800" w:type="dxa"/>
+        <w:tblLayout w:type="fixed"/>
+        <w:tblBorders>
+          <w:top w:val="nil"/>
+          <w:left w:val="nil"/>
+          <w:bottom w:val="nil"/>
+          <w:right w:val="nil"/>
+          <w:insideH w:val="nil"/>
+          <w:insideV w:val="nil"/>
+        </w:tblBorders>
       </w:tblPr>
       <w:tblGrid>
-        <w:gridCol w:w="1732"/>
-        <w:gridCol w:w="1245"/>
-        <w:gridCol w:w="496"/>
-        <w:gridCol w:w="3190"/>
-        <w:gridCol w:w="850"/>
-        <w:gridCol w:w="2726"/>
+        <w:gridCol w:w="5400"/>
+        <w:gridCol w:w="5400"/>
       </w:tblGrid>
       <w:tr>
-        <w:tc>
-          <w:tcPr>
-            <w:tcW w:w="1732" w:type="dxa"/>
-            <w:tcBorders>
-              <w:top w:val="nil"/>
-              <w:left w:val="nil"/>
-              <w:bottom w:val="dotted" w:sz="4" w:space="0" w:color="auto"/>
-              <w:right w:val="nil"/>
-            </w:tcBorders>
-            <w:vAlign w:val="center"/>
-          </w:tcPr>
-          <w:p>
-            <w:pPr>
-              <w:rPr>
-                <w:rFonts w:ascii="Helvetica Neue" w:hAnsi="Helvetica Neue"/>
+        <w:trPr>
+          <w:cantSplit/>
+        </w:trPr>
+        <w:tc>
+          <w:tcPr>
+            <w:tcW w:w="5400" w:type="dxa"/>
+            <w:vAlign w:val="top"/>
+            <w:tcMar>
+              <w:top w:w="100" w:type="dxa"/>
+              <w:bottom w:w="60" w:type="dxa"/>
+              <w:left w:w="0" w:type="dxa"/>
+              <w:right w:w="180" w:type="dxa"/>
+            </w:tcMar>
+            <w:tcBorders>
+              <w:top w:val="single" w:sz="5" w:color="777777"/>
+            </w:tcBorders>
+          </w:tcPr>
+          <w:p>
+            <w:pPr>
+              <w:keepNext/>
+              <w:keepLines/>
+              <w:spacing w:before="0" w:after="60" w:line="240" w:lineRule="auto"/>
+              <w:jc w:val="left"/>
+            </w:pPr>
+            <w:r>
+              <w:rPr>
+                <w:rFonts w:ascii="Arial" w:hAnsi="Arial"/>
                 <w:b/>
-                <w:bCs/>
-                <w:sz w:val="16"/>
-                <w:szCs w:val="16"/>
-              </w:rPr>
-            </w:pPr>
-            <w:r>
-              <w:rPr>
-                <w:rFonts w:ascii="Helvetica Neue" w:hAnsi="Helvetica Neue"/>
+                <w:color w:val="222222"/>
+                <w:sz w:val="20"/>
+                <w:szCs w:val="20"/>
+              </w:rPr>
+              <w:t>Entrega · HN Solutions</w:t>
+            </w:r>
+          </w:p>
+          <w:p>
+            <w:pPr>
+              <w:keepNext/>
+              <w:keepLines/>
+              <w:spacing w:before="0" w:after="35" w:line="240" w:lineRule="auto"/>
+              <w:jc w:val="left"/>
+            </w:pPr>
+            <w:r>
+              <w:rPr>
+                <w:rFonts w:ascii="Arial" w:hAnsi="Arial"/>
                 <w:b/>
-                <w:bCs/>
-                <w:sz w:val="16"/>
-                <w:szCs w:val="16"/>
-              </w:rPr>
-              <w:t xml:space="preserve">      FECHAHOY</w:t>
-            </w:r>
-          </w:p>
-        </w:tc>
-        <w:tc>
-          <w:tcPr>
-            <w:tcW w:w="1245" w:type="dxa"/>
-            <w:tcBorders>
-              <w:top w:val="nil"/>
-              <w:left w:val="nil"/>
-              <w:bottom w:val="nil"/>
-              <w:right w:val="nil"/>
-            </w:tcBorders>
-            <w:vAlign w:val="center"/>
-          </w:tcPr>
-          <w:p>
-            <w:pPr>
-              <w:rPr>
-                <w:rFonts w:ascii="Helvetica Neue" w:hAnsi="Helvetica Neue"/>
+                <w:color w:val="222222"/>
+                <w:sz w:val="18"/>
+                <w:szCs w:val="18"/>
+              </w:rPr>
+              <w:t>SIGNHNSTATUS</w:t>
+            </w:r>
+          </w:p>
+          <w:p>
+            <w:pPr>
+              <w:keepNext/>
+              <w:keepLines/>
+              <w:spacing w:before="0" w:after="35" w:line="240" w:lineRule="auto"/>
+              <w:jc w:val="left"/>
+            </w:pPr>
+            <w:r>
+              <w:rPr>
+                <w:rFonts w:ascii="Arial" w:hAnsi="Arial"/>
+                <w:color w:val="222222"/>
+                <w:sz w:val="18"/>
+                <w:szCs w:val="18"/>
+              </w:rPr>
+              <w:t>SIGNHNNAME</w:t>
+            </w:r>
+          </w:p>
+          <w:p>
+            <w:pPr>
+              <w:keepNext/>
+              <w:keepLines/>
+              <w:spacing w:before="0" w:after="35" w:line="240" w:lineRule="auto"/>
+              <w:jc w:val="left"/>
+            </w:pPr>
+            <w:r>
+              <w:rPr>
+                <w:rFonts w:ascii="Arial" w:hAnsi="Arial"/>
+                <w:color w:val="222222"/>
+                <w:sz w:val="18"/>
+                <w:szCs w:val="18"/>
+              </w:rPr>
+              <w:t>SIGNHNEMAIL</w:t>
+            </w:r>
+          </w:p>
+          <w:p>
+            <w:pPr>
+              <w:keepNext/>
+              <w:keepLines/>
+              <w:spacing w:before="0" w:after="35" w:line="240" w:lineRule="auto"/>
+              <w:jc w:val="left"/>
+            </w:pPr>
+            <w:r>
+              <w:rPr>
+                <w:rFonts w:ascii="Arial" w:hAnsi="Arial"/>
+                <w:color w:val="222222"/>
+                <w:sz w:val="18"/>
+                <w:szCs w:val="18"/>
+              </w:rPr>
+              <w:t>Fecha de firma: SIGNHNDATE</w:t>
+            </w:r>
+          </w:p>
+          <w:p>
+            <w:pPr>
+              <w:keepLines/>
+              <w:spacing w:before="0" w:after="0" w:line="240" w:lineRule="auto"/>
+              <w:jc w:val="left"/>
+            </w:pPr>
+            <w:r>
+              <w:rPr>
+                <w:rFonts w:ascii="Arial" w:hAnsi="Arial"/>
+                <w:color w:val="222222"/>
+                <w:sz w:val="18"/>
+                <w:szCs w:val="18"/>
+              </w:rPr>
+              <w:t>Hash de firma: SIGNHNHASH</w:t>
+            </w:r>
+          </w:p>
+        </w:tc>
+        <w:tc>
+          <w:tcPr>
+            <w:tcW w:w="5400" w:type="dxa"/>
+            <w:vAlign w:val="top"/>
+            <w:tcMar>
+              <w:top w:w="100" w:type="dxa"/>
+              <w:bottom w:w="60" w:type="dxa"/>
+              <w:left w:w="180" w:type="dxa"/>
+              <w:right w:w="0" w:type="dxa"/>
+            </w:tcMar>
+            <w:tcBorders>
+              <w:top w:val="single" w:sz="5" w:color="777777"/>
+            </w:tcBorders>
+          </w:tcPr>
+          <w:p>
+            <w:pPr>
+              <w:keepNext/>
+              <w:keepLines/>
+              <w:spacing w:before="0" w:after="60" w:line="240" w:lineRule="auto"/>
+              <w:jc w:val="left"/>
+            </w:pPr>
+            <w:r>
+              <w:rPr>
+                <w:rFonts w:ascii="Arial" w:hAnsi="Arial"/>
                 <w:b/>
-                <w:bCs/>
-                <w:sz w:val="16"/>
-                <w:szCs w:val="16"/>
-              </w:rPr>
-            </w:pPr>
-          </w:p>
-        </w:tc>
-        <w:tc>
-          <w:tcPr>
-            <w:tcW w:w="3686" w:type="dxa"/>
-            <w:gridSpan w:val="2"/>
-            <w:tcBorders>
-              <w:top w:val="nil"/>
-              <w:left w:val="nil"/>
-              <w:bottom w:val="dotted" w:sz="4" w:space="0" w:color="auto"/>
-              <w:right w:val="nil"/>
-            </w:tcBorders>
-            <w:vAlign w:val="center"/>
-          </w:tcPr>
-          <w:p>
-            <w:pPr>
-              <w:rPr>
-                <w:rFonts w:ascii="Helvetica Neue" w:hAnsi="Helvetica Neue"/>
-                <w:sz w:val="16"/>
-                <w:szCs w:val="16"/>
-              </w:rPr>
-            </w:pPr>
-            <w:r>
-              <w:rPr>
-                <w:rFonts w:ascii="Helvetica Neue" w:hAnsi="Helvetica Neue"/>
-                <w:sz w:val="16"/>
-                <w:szCs w:val="16"/>
-              </w:rPr>
-              <w:t xml:space="preserve">                 NO</w:t>
-            </w:r>
-            <w:r>
-              <w:rPr>
-                <w:rFonts w:ascii="Helvetica Neue" w:hAnsi="Helvetica Neue"/>
-                <w:color w:val="0D0D0D" w:themeColor="text1" w:themeTint="F2"/>
-                <w:sz w:val="16"/>
-                <w:szCs w:val="16"/>
-              </w:rPr>
-              <w:t>MBRETECNICO</w:t>
-            </w:r>
-          </w:p>
-        </w:tc>
-        <w:tc>
-          <w:tcPr>
-            <w:tcW w:w="850" w:type="dxa"/>
-            <w:tcBorders>
-              <w:top w:val="nil"/>
-              <w:left w:val="nil"/>
-              <w:bottom w:val="nil"/>
-              <w:right w:val="nil"/>
-            </w:tcBorders>
-          </w:tcPr>
-          <w:p>
-            <w:pPr>
-              <w:rPr>
-                <w:rFonts w:ascii="Helvetica Neue" w:hAnsi="Helvetica Neue"/>
-                <w:sz w:val="16"/>
-                <w:szCs w:val="16"/>
-              </w:rPr>
-            </w:pPr>
-          </w:p>
-        </w:tc>
-        <w:tc>
-          <w:tcPr>
-            <w:tcW w:w="2726" w:type="dxa"/>
-            <w:tcBorders>
-              <w:top w:val="nil"/>
-              <w:left w:val="nil"/>
-              <w:bottom w:val="dotted" w:sz="4" w:space="0" w:color="auto"/>
-              <w:right w:val="nil"/>
-            </w:tcBorders>
-          </w:tcPr>
-          <w:p>
-            <w:pPr>
-              <w:rPr>
-                <w:rFonts w:ascii="Helvetica Neue" w:hAnsi="Helvetica Neue"/>
-                <w:sz w:val="16"/>
-                <w:szCs w:val="16"/>
-              </w:rPr>
-            </w:pPr>
-          </w:p>
-        </w:tc>
-      </w:tr>
-      <w:tr>
-        <w:trPr>
-          <w:trHeight w:val="50"/>
-        </w:trPr>
-        <w:tc>
-          <w:tcPr>
-            <w:tcW w:w="3473" w:type="dxa"/>
-            <w:gridSpan w:val="3"/>
-            <w:tcBorders>
-              <w:top w:val="nil"/>
-              <w:left w:val="nil"/>
-              <w:bottom w:val="nil"/>
-              <w:right w:val="nil"/>
-            </w:tcBorders>
-            <w:vAlign w:val="center"/>
-          </w:tcPr>
-          <w:p>
-            <w:pPr>
-              <w:rPr>
-                <w:rFonts w:ascii="Helvetica Neue" w:hAnsi="Helvetica Neue"/>
-                <w:sz w:val="16"/>
-                <w:szCs w:val="16"/>
-              </w:rPr>
-            </w:pPr>
-            <w:r>
-              <w:rPr>
-                <w:rFonts w:ascii="Helvetica Neue" w:hAnsi="Helvetica Neue"/>
-                <w:sz w:val="16"/>
-                <w:szCs w:val="16"/>
-              </w:rPr>
-              <w:t xml:space="preserve">          </w:t>
-            </w:r>
-            <w:r>
-              <w:rPr>
-                <w:rFonts w:ascii="Helvetica Neue" w:hAnsi="Helvetica Neue"/>
-                <w:sz w:val="16"/>
-                <w:szCs w:val="16"/>
-              </w:rPr>
-              <w:t>Fecha</w:t>
-            </w:r>
-          </w:p>
-        </w:tc>
-        <w:tc>
-          <w:tcPr>
-            <w:tcW w:w="3190" w:type="dxa"/>
-            <w:tcBorders>
-              <w:top w:val="nil"/>
-              <w:left w:val="nil"/>
-              <w:bottom w:val="nil"/>
-              <w:right w:val="nil"/>
-            </w:tcBorders>
-            <w:vAlign w:val="center"/>
-          </w:tcPr>
-          <w:p>
-            <w:pPr>
-              <w:ind w:left="529"/>
-              <w:rPr>
-                <w:rFonts w:ascii="Helvetica Neue" w:hAnsi="Helvetica Neue"/>
-                <w:sz w:val="22"/>
-                <w:szCs w:val="22"/>
-              </w:rPr>
-            </w:pPr>
-            <w:r>
-              <w:rPr>
-                <w:rFonts w:ascii="Helvetica Neue" w:hAnsi="Helvetica Neue"/>
-                <w:sz w:val="16"/>
-                <w:szCs w:val="16"/>
-              </w:rPr>
-              <w:t xml:space="preserve">     </w:t>
-            </w:r>
-            <w:r>
-              <w:rPr>
-                <w:rFonts w:ascii="Helvetica Neue" w:hAnsi="Helvetica Neue"/>
-                <w:sz w:val="16"/>
-                <w:szCs w:val="16"/>
-              </w:rPr>
-              <w:t xml:space="preserve"> </w:t>
-            </w:r>
-            <w:r>
-              <w:rPr>
-                <w:rFonts w:ascii="Helvetica Neue" w:hAnsi="Helvetica Neue"/>
-                <w:sz w:val="16"/>
-                <w:szCs w:val="16"/>
-              </w:rPr>
-              <w:t xml:space="preserve"> </w:t>
-            </w:r>
-            <w:r>
-              <w:rPr>
-                <w:rFonts w:ascii="Helvetica Neue" w:hAnsi="Helvetica Neue"/>
-                <w:sz w:val="16"/>
-                <w:szCs w:val="16"/>
-              </w:rPr>
-              <w:t>Proveedor</w:t>
-            </w:r>
-          </w:p>
-        </w:tc>
-        <w:tc>
-          <w:tcPr>
-            <w:tcW w:w="850" w:type="dxa"/>
-            <w:tcBorders>
-              <w:top w:val="nil"/>
-              <w:left w:val="nil"/>
-              <w:bottom w:val="nil"/>
-              <w:right w:val="nil"/>
-            </w:tcBorders>
-          </w:tcPr>
-          <w:p>
-            <w:pPr>
-              <w:jc w:val="center"/>
-              <w:rPr>
-                <w:rFonts w:ascii="Helvetica Neue" w:hAnsi="Helvetica Neue"/>
-                <w:sz w:val="16"/>
-                <w:szCs w:val="16"/>
-              </w:rPr>
-            </w:pPr>
-          </w:p>
-        </w:tc>
-        <w:tc>
-          <w:tcPr>
-            <w:tcW w:w="2726" w:type="dxa"/>
-            <w:tcBorders>
-              <w:top w:val="nil"/>
-              <w:left w:val="nil"/>
-              <w:bottom w:val="nil"/>
-              <w:right w:val="nil"/>
-            </w:tcBorders>
-          </w:tcPr>
-          <w:p>
-            <w:pPr>
-              <w:jc w:val="center"/>
-              <w:rPr>
-                <w:rFonts w:ascii="Helvetica Neue" w:hAnsi="Helvetica Neue"/>
-                <w:sz w:val="22"/>
-                <w:szCs w:val="22"/>
-              </w:rPr>
-            </w:pPr>
-            <w:r>
-              <w:rPr>
-                <w:rFonts w:ascii="Helvetica Neue" w:hAnsi="Helvetica Neue"/>
-                <w:sz w:val="16"/>
-                <w:szCs w:val="16"/>
-              </w:rPr>
-              <w:t>Firma: FIRMAHN</w:t>
+                <w:color w:val="222222"/>
+                <w:sz w:val="20"/>
+                <w:szCs w:val="20"/>
+              </w:rPr>
+              <w:t>Recibe · Cliente</w:t>
+            </w:r>
+          </w:p>
+          <w:p>
+            <w:pPr>
+              <w:keepNext/>
+              <w:keepLines/>
+              <w:spacing w:before="0" w:after="35" w:line="240" w:lineRule="auto"/>
+              <w:jc w:val="left"/>
+            </w:pPr>
+            <w:r>
+              <w:rPr>
+                <w:rFonts w:ascii="Arial" w:hAnsi="Arial"/>
+                <w:b/>
+                <w:color w:val="222222"/>
+                <w:sz w:val="18"/>
+                <w:szCs w:val="18"/>
+              </w:rPr>
+              <w:t>SIGNCLIENTSTATUS</w:t>
+            </w:r>
+          </w:p>
+          <w:p>
+            <w:pPr>
+              <w:keepNext/>
+              <w:keepLines/>
+              <w:spacing w:before="0" w:after="35" w:line="240" w:lineRule="auto"/>
+              <w:jc w:val="left"/>
+            </w:pPr>
+            <w:r>
+              <w:rPr>
+                <w:rFonts w:ascii="Arial" w:hAnsi="Arial"/>
+                <w:color w:val="222222"/>
+                <w:sz w:val="18"/>
+                <w:szCs w:val="18"/>
+              </w:rPr>
+              <w:t>SIGNCLIENTNAME</w:t>
+            </w:r>
+          </w:p>
+          <w:p>
+            <w:pPr>
+              <w:keepNext/>
+              <w:keepLines/>
+              <w:spacing w:before="0" w:after="35" w:line="240" w:lineRule="auto"/>
+              <w:jc w:val="left"/>
+            </w:pPr>
+            <w:r>
+              <w:rPr>
+                <w:rFonts w:ascii="Arial" w:hAnsi="Arial"/>
+                <w:color w:val="222222"/>
+                <w:sz w:val="18"/>
+                <w:szCs w:val="18"/>
+              </w:rPr>
+              <w:t>SIGNCLIENTEMAIL</w:t>
+            </w:r>
+          </w:p>
+          <w:p>
+            <w:pPr>
+              <w:keepNext/>
+              <w:keepLines/>
+              <w:spacing w:before="0" w:after="35" w:line="240" w:lineRule="auto"/>
+              <w:jc w:val="left"/>
+            </w:pPr>
+            <w:r>
+              <w:rPr>
+                <w:rFonts w:ascii="Arial" w:hAnsi="Arial"/>
+                <w:color w:val="222222"/>
+                <w:sz w:val="18"/>
+                <w:szCs w:val="18"/>
+              </w:rPr>
+              <w:t>Fecha de firma: SIGNCLIENTDATE</w:t>
+            </w:r>
+          </w:p>
+          <w:p>
+            <w:pPr>
+              <w:keepLines/>
+              <w:spacing w:before="0" w:after="0" w:line="240" w:lineRule="auto"/>
+              <w:jc w:val="left"/>
+            </w:pPr>
+            <w:r>
+              <w:rPr>
+                <w:rFonts w:ascii="Arial" w:hAnsi="Arial"/>
+                <w:color w:val="222222"/>
+                <w:sz w:val="18"/>
+                <w:szCs w:val="18"/>
+              </w:rPr>
+              <w:t>Hash de firma: SIGNCLIENTHASH</w:t>
             </w:r>
           </w:p>
         </w:tc>
@@ -3925,318 +3883,19 @@
     </w:tbl>
     <w:p>
       <w:pPr>
-        <w:tabs>
-          <w:tab w:val="left" w:pos="9451"/>
-        </w:tabs>
-        <w:rPr>
-          <w:rFonts w:ascii="Helvetica Neue" w:hAnsi="Helvetica Neue"/>
-          <w:sz w:val="22"/>
-          <w:szCs w:val="22"/>
-        </w:rPr>
-      </w:pPr>
-    </w:p>
-    <w:p>
-      <w:pPr>
-        <w:spacing w:after="200" w:line="276" w:lineRule="auto"/>
-        <w:rPr>
-          <w:rFonts w:ascii="Helvetica Neue" w:hAnsi="Helvetica Neue"/>
-          <w:b/>
-          <w:bCs/>
-          <w:color w:val="595959" w:themeColor="text1" w:themeTint="A6"/>
-          <w:sz w:val="22"/>
-          <w:szCs w:val="22"/>
-        </w:rPr>
+        <w:keepLines/>
+        <w:spacing w:before="0" w:after="0" w:line="240" w:lineRule="auto"/>
+        <w:jc w:val="left"/>
       </w:pPr>
       <w:r>
         <w:rPr>
-          <w:rFonts w:ascii="Helvetica Neue" w:hAnsi="Helvetica Neue"/>
-          <w:b/>
-          <w:bCs/>
-          <w:color w:val="595959" w:themeColor="text1" w:themeTint="A6"/>
-          <w:sz w:val="22"/>
-          <w:szCs w:val="22"/>
+          <w:rFonts w:ascii="Arial" w:hAnsi="Arial"/>
+          <w:color w:val="222222"/>
+          <w:sz w:val="2"/>
+          <w:szCs w:val="2"/>
         </w:rPr>
-        <w:t>Recibe</w:t>
+        <w:t/>
       </w:r>
-    </w:p>
-    <w:tbl>
-      <w:tblPr>
-        <w:tblStyle w:val="Tablaconcuadrcula"/>
-        <w:tblW w:w="0" w:type="auto"/>
-        <w:tblLook w:val="04A0" w:firstRow="1" w:lastRow="0" w:firstColumn="1" w:lastColumn="0" w:noHBand="0" w:noVBand="1"/>
-      </w:tblPr>
-      <w:tblGrid>
-        <w:gridCol w:w="1732"/>
-        <w:gridCol w:w="1245"/>
-        <w:gridCol w:w="284"/>
-        <w:gridCol w:w="3402"/>
-        <w:gridCol w:w="850"/>
-        <w:gridCol w:w="2726"/>
-      </w:tblGrid>
-      <w:tr>
-        <w:tc>
-          <w:tcPr>
-            <w:tcW w:w="1732" w:type="dxa"/>
-            <w:tcBorders>
-              <w:top w:val="nil"/>
-              <w:left w:val="nil"/>
-              <w:bottom w:val="dotted" w:sz="4" w:space="0" w:color="auto"/>
-              <w:right w:val="nil"/>
-            </w:tcBorders>
-            <w:vAlign w:val="center"/>
-          </w:tcPr>
-          <w:p>
-            <w:pPr>
-              <w:rPr>
-                <w:rFonts w:ascii="Helvetica Neue" w:hAnsi="Helvetica Neue"/>
-                <w:b/>
-                <w:bCs/>
-                <w:sz w:val="16"/>
-                <w:szCs w:val="16"/>
-              </w:rPr>
-            </w:pPr>
-            <w:r>
-              <w:rPr>
-                <w:rFonts w:ascii="Helvetica Neue" w:hAnsi="Helvetica Neue"/>
-                <w:b/>
-                <w:bCs/>
-                <w:sz w:val="16"/>
-                <w:szCs w:val="16"/>
-              </w:rPr>
-              <w:t xml:space="preserve">       FECHAHOY</w:t>
-            </w:r>
-          </w:p>
-        </w:tc>
-        <w:tc>
-          <w:tcPr>
-            <w:tcW w:w="1245" w:type="dxa"/>
-            <w:tcBorders>
-              <w:top w:val="nil"/>
-              <w:left w:val="nil"/>
-              <w:bottom w:val="nil"/>
-              <w:right w:val="nil"/>
-            </w:tcBorders>
-            <w:vAlign w:val="center"/>
-          </w:tcPr>
-          <w:p>
-            <w:pPr>
-              <w:rPr>
-                <w:rFonts w:ascii="Helvetica Neue" w:hAnsi="Helvetica Neue"/>
-                <w:b/>
-                <w:bCs/>
-                <w:sz w:val="16"/>
-                <w:szCs w:val="16"/>
-              </w:rPr>
-            </w:pPr>
-          </w:p>
-        </w:tc>
-        <w:tc>
-          <w:tcPr>
-            <w:tcW w:w="3686" w:type="dxa"/>
-            <w:gridSpan w:val="2"/>
-            <w:tcBorders>
-              <w:top w:val="nil"/>
-              <w:left w:val="nil"/>
-              <w:bottom w:val="dotted" w:sz="4" w:space="0" w:color="auto"/>
-              <w:right w:val="nil"/>
-            </w:tcBorders>
-            <w:vAlign w:val="center"/>
-          </w:tcPr>
-          <w:p>
-            <w:pPr>
-              <w:rPr>
-                <w:rFonts w:ascii="Helvetica Neue" w:hAnsi="Helvetica Neue"/>
-                <w:sz w:val="16"/>
-                <w:szCs w:val="16"/>
-              </w:rPr>
-            </w:pPr>
-            <w:r>
-              <w:rPr>
-                <w:rFonts w:ascii="Helvetica Neue" w:hAnsi="Helvetica Neue"/>
-                <w:sz w:val="16"/>
-                <w:szCs w:val="16"/>
-              </w:rPr>
-              <w:t xml:space="preserve">                              RSCLIENTE</w:t>
-            </w:r>
-          </w:p>
-        </w:tc>
-        <w:tc>
-          <w:tcPr>
-            <w:tcW w:w="850" w:type="dxa"/>
-            <w:tcBorders>
-              <w:top w:val="nil"/>
-              <w:left w:val="nil"/>
-              <w:bottom w:val="nil"/>
-              <w:right w:val="nil"/>
-            </w:tcBorders>
-          </w:tcPr>
-          <w:p>
-            <w:pPr>
-              <w:rPr>
-                <w:rFonts w:ascii="Helvetica Neue" w:hAnsi="Helvetica Neue"/>
-                <w:sz w:val="16"/>
-                <w:szCs w:val="16"/>
-              </w:rPr>
-            </w:pPr>
-          </w:p>
-        </w:tc>
-        <w:tc>
-          <w:tcPr>
-            <w:tcW w:w="2726" w:type="dxa"/>
-            <w:tcBorders>
-              <w:top w:val="nil"/>
-              <w:left w:val="nil"/>
-              <w:bottom w:val="dotted" w:sz="4" w:space="0" w:color="auto"/>
-              <w:right w:val="nil"/>
-            </w:tcBorders>
-          </w:tcPr>
-          <w:p>
-            <w:pPr>
-              <w:rPr>
-                <w:rFonts w:ascii="Helvetica Neue" w:hAnsi="Helvetica Neue"/>
-                <w:sz w:val="16"/>
-                <w:szCs w:val="16"/>
-              </w:rPr>
-            </w:pPr>
-          </w:p>
-        </w:tc>
-      </w:tr>
-      <w:tr>
-        <w:tc>
-          <w:tcPr>
-            <w:tcW w:w="3261" w:type="dxa"/>
-            <w:gridSpan w:val="3"/>
-            <w:tcBorders>
-              <w:top w:val="nil"/>
-              <w:left w:val="nil"/>
-              <w:bottom w:val="nil"/>
-              <w:right w:val="nil"/>
-            </w:tcBorders>
-          </w:tcPr>
-          <w:p>
-            <w:pPr>
-              <w:rPr>
-                <w:rFonts w:ascii="Helvetica Neue" w:hAnsi="Helvetica Neue"/>
-                <w:sz w:val="16"/>
-                <w:szCs w:val="16"/>
-              </w:rPr>
-            </w:pPr>
-            <w:r>
-              <w:rPr>
-                <w:rFonts w:ascii="Helvetica Neue" w:hAnsi="Helvetica Neue"/>
-                <w:sz w:val="16"/>
-                <w:szCs w:val="16"/>
-              </w:rPr>
-              <w:t xml:space="preserve">          </w:t>
-            </w:r>
-            <w:r>
-              <w:rPr>
-                <w:rFonts w:ascii="Helvetica Neue" w:hAnsi="Helvetica Neue"/>
-                <w:sz w:val="16"/>
-                <w:szCs w:val="16"/>
-              </w:rPr>
-              <w:t>Fecha</w:t>
-            </w:r>
-          </w:p>
-        </w:tc>
-        <w:tc>
-          <w:tcPr>
-            <w:tcW w:w="3402" w:type="dxa"/>
-            <w:tcBorders>
-              <w:top w:val="nil"/>
-              <w:left w:val="nil"/>
-              <w:bottom w:val="nil"/>
-              <w:right w:val="nil"/>
-            </w:tcBorders>
-            <w:vAlign w:val="center"/>
-          </w:tcPr>
-          <w:p>
-            <w:pPr>
-              <w:rPr>
-                <w:rFonts w:ascii="Helvetica Neue" w:hAnsi="Helvetica Neue"/>
-                <w:sz w:val="22"/>
-                <w:szCs w:val="22"/>
-              </w:rPr>
-            </w:pPr>
-            <w:r>
-              <w:rPr>
-                <w:rFonts w:ascii="Helvetica Neue" w:hAnsi="Helvetica Neue"/>
-                <w:sz w:val="16"/>
-                <w:szCs w:val="16"/>
-              </w:rPr>
-              <w:t xml:space="preserve">                          Cliente</w:t>
-            </w:r>
-            <w:r>
-              <w:rPr>
-                <w:rFonts w:ascii="Helvetica Neue" w:hAnsi="Helvetica Neue"/>
-                <w:sz w:val="16"/>
-                <w:szCs w:val="16"/>
-              </w:rPr>
-              <w:t xml:space="preserve"> </w:t>
-            </w:r>
-          </w:p>
-        </w:tc>
-        <w:tc>
-          <w:tcPr>
-            <w:tcW w:w="850" w:type="dxa"/>
-            <w:tcBorders>
-              <w:top w:val="nil"/>
-              <w:left w:val="nil"/>
-              <w:bottom w:val="nil"/>
-              <w:right w:val="nil"/>
-            </w:tcBorders>
-          </w:tcPr>
-          <w:p>
-            <w:pPr>
-              <w:jc w:val="center"/>
-              <w:rPr>
-                <w:rFonts w:ascii="Helvetica Neue" w:hAnsi="Helvetica Neue"/>
-                <w:sz w:val="16"/>
-                <w:szCs w:val="16"/>
-              </w:rPr>
-            </w:pPr>
-          </w:p>
-        </w:tc>
-        <w:tc>
-          <w:tcPr>
-            <w:tcW w:w="2726" w:type="dxa"/>
-            <w:tcBorders>
-              <w:top w:val="nil"/>
-              <w:left w:val="nil"/>
-              <w:bottom w:val="nil"/>
-              <w:right w:val="nil"/>
-            </w:tcBorders>
-          </w:tcPr>
-          <w:p>
-            <w:pPr>
-              <w:jc w:val="center"/>
-              <w:rPr>
-                <w:rFonts w:ascii="Helvetica Neue" w:hAnsi="Helvetica Neue"/>
-                <w:sz w:val="22"/>
-                <w:szCs w:val="22"/>
-              </w:rPr>
-            </w:pPr>
-            <w:r>
-              <w:rPr>
-                <w:rFonts w:ascii="Helvetica Neue" w:hAnsi="Helvetica Neue"/>
-                <w:sz w:val="16"/>
-                <w:szCs w:val="16"/>
-              </w:rPr>
-              <w:t>Firma: FIRMACLIENTE</w:t>
-            </w:r>
-          </w:p>
-        </w:tc>
-      </w:tr>
-    </w:tbl>
-    <w:p>
-      <w:pPr>
-        <w:tabs>
-          <w:tab w:val="left" w:pos="8112"/>
-        </w:tabs>
-        <w:rPr>
-          <w:rFonts w:ascii="Helvetica Neue" w:hAnsi="Helvetica Neue"/>
-        </w:rPr>
-      </w:pPr>
     </w:p>
     <w:sectPr>
       <w:footerReference w:type="default" r:id="rId8"/>

</xml_diff>

<commit_message>
Release 2.5.4: update delivery support contact and finalized order badge
</commit_message>
<xml_diff>
--- a/HNControl.Web/assets/legal-templates/Acta_Entrega_Material_Servicios.docx
+++ b/HNControl.Web/assets/legal-templates/Acta_Entrega_Material_Servicios.docx
@@ -364,7 +364,7 @@
                 <w:sz w:val="14"/>
                 <w:szCs w:val="14"/>
               </w:rPr>
-              <w:t xml:space="preserve">+52 (55) </w:t>
+              <w:t xml:space="preserve">Llamada y WhatsApp 5526014566</w:t>
             </w:r>
             <w:r>
               <w:rPr>
@@ -375,7 +375,7 @@
                 <w:sz w:val="14"/>
                 <w:szCs w:val="14"/>
               </w:rPr>
-              <w:t>4742 6456</w:t>
+              <w:t/>
             </w:r>
             <w:r>
               <w:rPr>
@@ -422,7 +422,7 @@
                 <w:szCs w:val="14"/>
                 <w:u w:val="single"/>
               </w:rPr>
-              <w:t>soporte</w:t>
+              <w:t>soporte@hubnet-solutions.com.mx</w:t>
             </w:r>
             <w:r>
               <w:rPr>
@@ -434,7 +434,7 @@
                 <w:szCs w:val="14"/>
                 <w:u w:val="single"/>
               </w:rPr>
-              <w:t>@</w:t>
+              <w:t/>
             </w:r>
             <w:r>
               <w:rPr>
@@ -446,7 +446,7 @@
                 <w:szCs w:val="14"/>
                 <w:u w:val="single"/>
               </w:rPr>
-              <w:t>hubnet-solutions.net</w:t>
+              <w:t/>
             </w:r>
             <w:r>
               <w:rPr>
@@ -3513,18 +3513,18 @@
                 <w:sz w:val="18"/>
                 <w:szCs w:val="18"/>
               </w:rPr>
-              <w:t xml:space="preserve">Teléfono: </w:t>
-            </w:r>
-            <w:r>
-              <w:rPr>
-                <w:rFonts w:ascii="Helvetica Neue" w:hAnsi="Helvetica Neue"/>
-                <w:i/>
-                <w:iCs/>
-                <w:color w:val="404040" w:themeColor="text1" w:themeTint="BF"/>
-                <w:sz w:val="18"/>
-                <w:szCs w:val="18"/>
-              </w:rPr>
-              <w:t>55 4742 6456</w:t>
+              <w:t xml:space="preserve">Llamada y WhatsApp: 5526014566</w:t>
+            </w:r>
+            <w:r>
+              <w:rPr>
+                <w:rFonts w:ascii="Helvetica Neue" w:hAnsi="Helvetica Neue"/>
+                <w:i/>
+                <w:iCs/>
+                <w:color w:val="404040" w:themeColor="text1" w:themeTint="BF"/>
+                <w:sz w:val="18"/>
+                <w:szCs w:val="18"/>
+              </w:rPr>
+              <w:t/>
             </w:r>
           </w:p>
           <w:p>
@@ -3568,7 +3568,7 @@
                 <w:u w:val="single"/>
                 <w:lang w:val="pt-BR"/>
               </w:rPr>
-              <w:t>soporte@</w:t>
+              <w:t>soporte@hubnet-solutions.com.mx</w:t>
             </w:r>
             <w:r>
               <w:rPr>
@@ -3581,7 +3581,7 @@
                 <w:u w:val="single"/>
                 <w:lang w:val="pt-BR"/>
               </w:rPr>
-              <w:t>hubnet-solutions.net</w:t>
+              <w:t/>
             </w:r>
           </w:p>
         </w:tc>

</xml_diff>